<commit_message>
Expande a cópia DOCX para todas as 9 páginas de Privacidade e segurança
Além de Política de Privacidade, Termos de Uso e visão geral, inclui Fluxo
de dados, RIPD, Baseline de segurança, Resposta a incidentes, Base legal
(LGPD) e Governança — 299 blocos, com tabelas renderizadas como linhas
"célula · célula" na ordem do documento. Cobertura de texto validada contra
os 9 HTMLs: 0 palavra fora.

🤖 Generated with Codebuff
Co-Authored-By: Codebuff <noreply@codebuff.com>
</commit_message>
<xml_diff>
--- a/Docs/Servicos_Privacidade_Termos.docx
+++ b/Docs/Servicos_Privacidade_Termos.docx
@@ -29,6 +29,93 @@
         <w:pStyle w:val="Heading1"/>
       </w:pPr>
       <w:r>
+        <w:t>Privacidade e segurança (visão geral)</w:t>
+      </w:r>
+    </w:p>
+    <w:p>
+      <w:pPr>
+        <w:pStyle w:val="ListBullet"/>
+      </w:pPr>
+      <w:r>
+        <w:t>Política de Privacidade Explica como seus dados são usados ao preencher os formulários e quais são seus direitos.</w:t>
+      </w:r>
+    </w:p>
+    <w:p>
+      <w:pPr>
+        <w:pStyle w:val="ListBullet"/>
+      </w:pPr>
+      <w:r>
+        <w:t>Termos de Uso Condições de uso da ferramenta e o que esperamos de quem gera os PDFs.</w:t>
+      </w:r>
+    </w:p>
+    <w:p>
+      <w:pPr>
+        <w:pStyle w:val="ListBullet"/>
+      </w:pPr>
+      <w:r>
+        <w:t>Fluxo de dados Resumo do que acontece com as informações no seu navegador até o arquivo PDF.</w:t>
+      </w:r>
+    </w:p>
+    <w:p>
+      <w:pPr>
+        <w:pStyle w:val="ListBullet"/>
+      </w:pPr>
+      <w:r>
+        <w:t>Impacto na privacidade (RIPD) Como avaliamos os riscos para seus dados neste tipo de ferramenta.</w:t>
+      </w:r>
+    </w:p>
+    <w:p>
+      <w:pPr>
+        <w:pStyle w:val="ListBullet"/>
+      </w:pPr>
+      <w:r>
+        <w:t>Segurança da plataforma Medidas que ajudam a manter o serviço dos formulários fiável e protegido.</w:t>
+      </w:r>
+    </w:p>
+    <w:p>
+      <w:pPr>
+        <w:pStyle w:val="ListBullet"/>
+      </w:pPr>
+      <w:r>
+        <w:t>Resposta a incidentes O que fazemos se algo correr mal com a segurança ou a disponibilidade do serviço.</w:t>
+      </w:r>
+    </w:p>
+    <w:p>
+      <w:pPr>
+        <w:pStyle w:val="ListBullet"/>
+      </w:pPr>
+      <w:r>
+        <w:t>Bases legais (LGPD) Enquadramento legal que permite tratar os dados neste contexto.</w:t>
+      </w:r>
+    </w:p>
+    <w:p>
+      <w:pPr>
+        <w:pStyle w:val="ListBullet"/>
+      </w:pPr>
+      <w:r>
+        <w:t>Governança Como a empresa organiza e atualiza estas políticas ao longo do tempo.</w:t>
+      </w:r>
+    </w:p>
+    <w:p>
+      <w:r>
+        <w:t>Revisão: validado periodicamente com Jurídico e Privacidade sempre que há mudança de versão da aplicação ou o fluxo de dados.</w:t>
+      </w:r>
+    </w:p>
+    <w:p>
+      <w:r>
+        <w:t>Última validação em: — (data/hora do último commit/push no repositório Git)</w:t>
+      </w:r>
+    </w:p>
+    <w:p>
+      <w:r>
+        <w:br w:type="page"/>
+      </w:r>
+    </w:p>
+    <w:p>
+      <w:pPr>
+        <w:pStyle w:val="Heading1"/>
+      </w:pPr>
+      <w:r>
         <w:t>Política de Privacidade</w:t>
       </w:r>
     </w:p>
@@ -728,7 +815,33 @@
         <w:pStyle w:val="Heading1"/>
       </w:pPr>
       <w:r>
-        <w:t>Privacidade e segurança (visão geral)</w:t>
+        <w:t>Fluxo de dados</w:t>
+      </w:r>
+    </w:p>
+    <w:p>
+      <w:r>
+        <w:t>Este documento descreve o fluxo de dados da ferramenta de formulários e PDF na perspectiva técnica, alinhado ao modelo corporativo e complementado com o comportamento das versões que disponibilizam rascunho local.</w:t>
+      </w:r>
+    </w:p>
+    <w:p>
+      <w:pPr>
+        <w:pStyle w:val="Heading2"/>
+      </w:pPr>
+      <w:r>
+        <w:t>Entrada</w:t>
+      </w:r>
+    </w:p>
+    <w:p>
+      <w:r>
+        <w:t>Usuário insere dados manualmente nos formulários HTML servidos estaticamente.</w:t>
+      </w:r>
+    </w:p>
+    <w:p>
+      <w:pPr>
+        <w:pStyle w:val="Heading2"/>
+      </w:pPr>
+      <w:r>
+        <w:t>Processamento</w:t>
       </w:r>
     </w:p>
     <w:p>
@@ -736,7 +849,7 @@
         <w:pStyle w:val="ListBullet"/>
       </w:pPr>
       <w:r>
-        <w:t>Política de Privacidade Explica como seus dados são usados ao preencher os formulários e quais são seus direitos.</w:t>
+        <w:t>Processamento ocorre exclusivamente no navegador.</w:t>
       </w:r>
     </w:p>
     <w:p>
@@ -744,7 +857,17 @@
         <w:pStyle w:val="ListBullet"/>
       </w:pPr>
       <w:r>
-        <w:t>Termos de Uso Condições de uso da ferramenta e o que esperamos de quem gera os PDFs.</w:t>
+        <w:t>Dados mantidos em memória (RAM) durante a sessão de preenchimento e geração do PDF.</w:t>
+      </w:r>
+    </w:p>
+    <w:p>
+      <w:r>
+        <w:t>Modelo corporativo original (minimização máxima): ausência de uso de localStorage, sessionStorage ou IndexedDB para dados pessoais — estado puramente efêmero.</w:t>
+      </w:r>
+    </w:p>
+    <w:p>
+      <w:r>
+        <w:t>Versões implantadas com recurso de rascunho: pode existir uso controlado de localStorage (ou equivalente) apenas para permitir retomar o preenchimento no mesmo navegador/dispositivo, com:</w:t>
       </w:r>
     </w:p>
     <w:p>
@@ -752,7 +875,7 @@
         <w:pStyle w:val="ListBullet"/>
       </w:pPr>
       <w:r>
-        <w:t>Fluxo de dados Resumo do que acontece com as informações no seu navegador até o arquivo PDF.</w:t>
+        <w:t>eliminação disponível via Descartar rascunho;</w:t>
       </w:r>
     </w:p>
     <w:p>
@@ -760,7 +883,7 @@
         <w:pStyle w:val="ListBullet"/>
       </w:pPr>
       <w:r>
-        <w:t>Impacto na privacidade (RIPD) Como avaliamos os riscos para seus dados neste tipo de ferramenta.</w:t>
+        <w:t>finalidade limitada à conveniência do usuário no mesmo dispositivo, até eliminação por Descartar rascunho ou limpeza local do navegador;</w:t>
       </w:r>
     </w:p>
     <w:p>
@@ -768,7 +891,15 @@
         <w:pStyle w:val="ListBullet"/>
       </w:pPr>
       <w:r>
-        <w:t>Segurança da plataforma Medidas que ajudam a manter o serviço dos formulários fiável e protegido.</w:t>
+        <w:t>sem envio desses dados ao servidor da aplicação para armazenamento remoto do formulário.</w:t>
+      </w:r>
+    </w:p>
+    <w:p>
+      <w:pPr>
+        <w:pStyle w:val="Heading2"/>
+      </w:pPr>
+      <w:r>
+        <w:t>Geração</w:t>
       </w:r>
     </w:p>
     <w:p>
@@ -776,7 +907,15 @@
         <w:pStyle w:val="ListBullet"/>
       </w:pPr>
       <w:r>
-        <w:t>Resposta a incidentes O que fazemos se algo correr mal com a segurança ou a disponibilidade do serviço.</w:t>
+        <w:t>Biblioteca JavaScript gera o PDF localmente no dispositivo.</w:t>
+      </w:r>
+    </w:p>
+    <w:p>
+      <w:pPr>
+        <w:pStyle w:val="Heading2"/>
+      </w:pPr>
+      <w:r>
+        <w:t>Saída</w:t>
       </w:r>
     </w:p>
     <w:p>
@@ -784,7 +923,15 @@
         <w:pStyle w:val="ListBullet"/>
       </w:pPr>
       <w:r>
-        <w:t>Bases legais (LGPD) Enquadramento legal que permite tratar os dados neste contexto.</w:t>
+        <w:t>Download direto para o dispositivo do usuário.</w:t>
+      </w:r>
+    </w:p>
+    <w:p>
+      <w:pPr>
+        <w:pStyle w:val="Heading2"/>
+      </w:pPr>
+      <w:r>
+        <w:t>Descarte</w:t>
       </w:r>
     </w:p>
     <w:p>
@@ -792,7 +939,1229 @@
         <w:pStyle w:val="ListBullet"/>
       </w:pPr>
       <w:r>
-        <w:t>Governança Como a empresa organiza e atualiza estas políticas ao longo do tempo.</w:t>
+        <w:t>Persistência do preenchimento e do rascunho local segue os fluxos da aplicação atual: dados permanecem após gerar o PDF até ação explícita do usuário (ex.: Descartar rascunho), limpeza de armazenamento local ou nova sessão, conforme o navegador.</w:t>
+      </w:r>
+    </w:p>
+    <w:p>
+      <w:pPr>
+        <w:pStyle w:val="ListBullet"/>
+      </w:pPr>
+      <w:r>
+        <w:t>Rascunho local é removido quando o usuário aciona Descartar rascunho.</w:t>
+      </w:r>
+    </w:p>
+    <w:p>
+      <w:pPr>
+        <w:pStyle w:val="Heading2"/>
+      </w:pPr>
+      <w:r>
+        <w:t>Observação — O que não há (por desenho)</w:t>
+      </w:r>
+    </w:p>
+    <w:p>
+      <w:r>
+        <w:t>Não há, nos termos desta solução:</w:t>
+      </w:r>
+    </w:p>
+    <w:p>
+      <w:pPr>
+        <w:pStyle w:val="ListBullet"/>
+      </w:pPr>
+      <w:r>
+        <w:t>Backend aplicacional obrigatório para guardar o formulário completo nos servidores desta app;</w:t>
+      </w:r>
+    </w:p>
+    <w:p>
+      <w:pPr>
+        <w:pStyle w:val="ListBullet"/>
+      </w:pPr>
+      <w:r>
+        <w:t>API própria para receber os campos preenchidos para conclusão do PDF;</w:t>
+      </w:r>
+    </w:p>
+    <w:p>
+      <w:pPr>
+        <w:pStyle w:val="ListBullet"/>
+      </w:pPr>
+      <w:r>
+        <w:t>Banco de dados central nesta aplicação para os dados digitados no formulário;</w:t>
+      </w:r>
+    </w:p>
+    <w:p>
+      <w:pPr>
+        <w:pStyle w:val="ListBullet"/>
+      </w:pPr>
+      <w:r>
+        <w:t>Envio obrigatório dos dados do formulário para servidores para gerar o PDF;</w:t>
+      </w:r>
+    </w:p>
+    <w:p>
+      <w:pPr>
+        <w:pStyle w:val="ListBullet"/>
+      </w:pPr>
+      <w:r>
+        <w:t>Logs de aplicação contendo payload de formulários com dados pessoais;</w:t>
+      </w:r>
+    </w:p>
+    <w:p>
+      <w:pPr>
+        <w:pStyle w:val="ListBullet"/>
+      </w:pPr>
+      <w:r>
+        <w:t>Chaves de acesso no código-fonte — apenas verificadores derivados (SHA-256 + salt) existem no guard.js.</w:t>
+      </w:r>
+    </w:p>
+    <w:p>
+      <w:pPr>
+        <w:pStyle w:val="Heading2"/>
+      </w:pPr>
+      <w:r>
+        <w:t>Controle de acesso (quando ativo)</w:t>
+      </w:r>
+    </w:p>
+    <w:p>
+      <w:r>
+        <w:t>Além do fluxo de preenchimento, páginas protegidas utilizam sessionStorage para:</w:t>
+      </w:r>
+    </w:p>
+    <w:p>
+      <w:pPr>
+        <w:pStyle w:val="ListBullet"/>
+      </w:pPr>
+      <w:r>
+        <w:t>Armazenar um token aleatório (gerado via crypto.getRandomValues());</w:t>
+      </w:r>
+    </w:p>
+    <w:p>
+      <w:pPr>
+        <w:pStyle w:val="ListBullet"/>
+      </w:pPr>
+      <w:r>
+        <w:t>Armazenar o timestamp de expiração da sessão;</w:t>
+      </w:r>
+    </w:p>
+    <w:p>
+      <w:pPr>
+        <w:pStyle w:val="ListBullet"/>
+      </w:pPr>
+      <w:r>
+        <w:t>Armazenar o path da rota autenticada.</w:t>
+      </w:r>
+    </w:p>
+    <w:p>
+      <w:r>
+        <w:t>Estes dados de sessão não contêm a chave de acesso inserida pelo usuário, não são transmitidos a servidores e são limpos automaticamente ao fechar a aba ou ao acionar Encerrar acesso.</w:t>
+      </w:r>
+    </w:p>
+    <w:p>
+      <w:r>
+        <w:t>Infraestrutura de hospedagem/CDN pode gerar logs operacionais sem conteúdo do formulário — devem ser considerados no inventário de tratamentos quando aplicável.</w:t>
+      </w:r>
+    </w:p>
+    <w:p>
+      <w:pPr>
+        <w:pStyle w:val="Heading2"/>
+      </w:pPr>
+      <w:r>
+        <w:t>Diagrama (texto)</w:t>
+      </w:r>
+    </w:p>
+    <w:p>
+      <w:r>
+        <w:t>Revisão: validado periodicamente com Jurídico e Privacidade sempre que há mudança de versão da aplicação ou o fluxo de dados.</w:t>
+      </w:r>
+    </w:p>
+    <w:p>
+      <w:r>
+        <w:t>Última validação em: — (data/hora do último commit/push no repositório Git)</w:t>
+      </w:r>
+    </w:p>
+    <w:p>
+      <w:r>
+        <w:br w:type="page"/>
+      </w:r>
+    </w:p>
+    <w:p>
+      <w:pPr>
+        <w:pStyle w:val="Heading1"/>
+      </w:pPr>
+      <w:r>
+        <w:t>RIPD — Relatório de Impacto à Privacidade</w:t>
+      </w:r>
+    </w:p>
+    <w:p>
+      <w:r>
+        <w:t>Referência: Lei nº 13.709/2018 (LGPD), arts. 38 e seguintes. Modelo alinhado ao relatório corporativo de referência, passível de complementação pelo DPO.</w:t>
+      </w:r>
+    </w:p>
+    <w:p>
+      <w:pPr>
+        <w:pStyle w:val="Heading2"/>
+      </w:pPr>
+      <w:r>
+        <w:t>1. Descrição</w:t>
+      </w:r>
+    </w:p>
+    <w:p>
+      <w:r>
+        <w:t>Ferramenta de geração de PDF com processamento local no navegador, destinada ao uso interno para suporte aos formulários de admissão e assistência médica conforme versões implantadas.</w:t>
+      </w:r>
+    </w:p>
+    <w:p>
+      <w:pPr>
+        <w:pStyle w:val="Heading2"/>
+      </w:pPr>
+      <w:r>
+        <w:t>2. Natureza do Tratamento</w:t>
+      </w:r>
+    </w:p>
+    <w:p>
+      <w:pPr>
+        <w:pStyle w:val="ListBullet"/>
+      </w:pPr>
+      <w:r>
+        <w:t>Dados inseridos voluntariamente pelo usuário nos formulários;</w:t>
+      </w:r>
+    </w:p>
+    <w:p>
+      <w:pPr>
+        <w:pStyle w:val="ListBullet"/>
+      </w:pPr>
+      <w:r>
+        <w:t>Processamento temporário em memória durante preenchimento e geração do PDF;</w:t>
+      </w:r>
+    </w:p>
+    <w:p>
+      <w:pPr>
+        <w:pStyle w:val="ListBullet"/>
+      </w:pPr>
+      <w:r>
+        <w:t>Ausência de armazenamento centralizado dos dados do formulário em servidores desta aplicação;</w:t>
+      </w:r>
+    </w:p>
+    <w:p>
+      <w:pPr>
+        <w:pStyle w:val="ListBullet"/>
+      </w:pPr>
+      <w:r>
+        <w:t>Opcionalmente, rascunho apenas no navegador (quando a versão assim previr), com função de descarte pelo usuário.</w:t>
+      </w:r>
+    </w:p>
+    <w:p>
+      <w:pPr>
+        <w:pStyle w:val="Heading2"/>
+      </w:pPr>
+      <w:r>
+        <w:t>3. Riscos Identificados</w:t>
+      </w:r>
+    </w:p>
+    <w:p>
+      <w:r>
+        <w:t>Risco  ·  Descrição</w:t>
+      </w:r>
+    </w:p>
+    <w:p>
+      <w:r>
+        <w:t>Exposição local  ·  PDF ou sessão em dispositivo partilhado ou comprometido</w:t>
+      </w:r>
+    </w:p>
+    <w:p>
+      <w:r>
+        <w:t>Uso indevido  ·  Informações falsas ou utilização contra políticas internas</w:t>
+      </w:r>
+    </w:p>
+    <w:p>
+      <w:r>
+        <w:t>Integridade da entrega  ·  Alteração maliciosa dos artefatos estáticos ou cadência de deploy</w:t>
+      </w:r>
+    </w:p>
+    <w:p>
+      <w:r>
+        <w:t>Dependências  ·  Vulnerabilidades em bibliotecas JS de terceiros</w:t>
+      </w:r>
+    </w:p>
+    <w:p>
+      <w:pPr>
+        <w:pStyle w:val="Heading2"/>
+      </w:pPr>
+      <w:r>
+        <w:t>4. Medidas de Mitigação</w:t>
+      </w:r>
+    </w:p>
+    <w:p>
+      <w:pPr>
+        <w:pStyle w:val="ListBullet"/>
+      </w:pPr>
+      <w:r>
+        <w:t>Não persistência central nos termos da arquitetura atual da ferramenta;</w:t>
+      </w:r>
+    </w:p>
+    <w:p>
+      <w:pPr>
+        <w:pStyle w:val="ListBullet"/>
+      </w:pPr>
+      <w:r>
+        <w:t>Processamento local para geração do PDF;</w:t>
+      </w:r>
+    </w:p>
+    <w:p>
+      <w:pPr>
+        <w:pStyle w:val="ListBullet"/>
+      </w:pPr>
+      <w:r>
+        <w:t>Uso de HTTPS em produção;</w:t>
+      </w:r>
+    </w:p>
+    <w:p>
+      <w:pPr>
+        <w:pStyle w:val="ListBullet"/>
+      </w:pPr>
+      <w:r>
+        <w:t>Baseline de segurança e gestão de dependências (Baseline de segurança);</w:t>
+      </w:r>
+    </w:p>
+    <w:p>
+      <w:pPr>
+        <w:pStyle w:val="ListBullet"/>
+      </w:pPr>
+      <w:r>
+        <w:t>Comunicações na UI (ex.: decisões LGPD na geração do PDF);</w:t>
+      </w:r>
+    </w:p>
+    <w:p>
+      <w:pPr>
+        <w:pStyle w:val="ListBullet"/>
+      </w:pPr>
+      <w:r>
+        <w:t>Função de descarte de rascunho quando aplicável.</w:t>
+      </w:r>
+    </w:p>
+    <w:p>
+      <w:pPr>
+        <w:pStyle w:val="Heading2"/>
+      </w:pPr>
+      <w:r>
+        <w:t>5. Avaliação de risco</w:t>
+      </w:r>
+    </w:p>
+    <w:p>
+      <w:r>
+        <w:t>Risco BAIXO a MÉDIO-BAIXO no que respeita a tratamentos remotos centralizados por esta app, considerando:</w:t>
+      </w:r>
+    </w:p>
+    <w:p>
+      <w:pPr>
+        <w:pStyle w:val="ListBullet"/>
+      </w:pPr>
+      <w:r>
+        <w:t>Não há retenção em bases remotas desta solução para os dados digitados no formulário;</w:t>
+      </w:r>
+    </w:p>
+    <w:p>
+      <w:pPr>
+        <w:pStyle w:val="ListBullet"/>
+      </w:pPr>
+      <w:r>
+        <w:t>Não há compartilhamento por esta camada com terceiros para fins descritos na política;</w:t>
+      </w:r>
+    </w:p>
+    <w:p>
+      <w:pPr>
+        <w:pStyle w:val="ListBullet"/>
+      </w:pPr>
+      <w:r>
+        <w:t>Tráfego obrigatório dos campos do formulário para servidores próprios da aplicação não faz parte do fluxo de conclusão do PDF.</w:t>
+      </w:r>
+    </w:p>
+    <w:p>
+      <w:r>
+        <w:t>Riscos residuais concentram-se em ambiente do usuário, integridade do deploy e cadeia de dependências — ver mitigações acima.</w:t>
+      </w:r>
+    </w:p>
+    <w:p>
+      <w:pPr>
+        <w:pStyle w:val="Heading2"/>
+      </w:pPr>
+      <w:r>
+        <w:t>6. Conclusão</w:t>
+      </w:r>
+    </w:p>
+    <w:p>
+      <w:r>
+        <w:t>A solução, adequadamente documentada e operada, tende a ser compatível com os princípios da LGPD:</w:t>
+      </w:r>
+    </w:p>
+    <w:p>
+      <w:pPr>
+        <w:pStyle w:val="ListBullet"/>
+      </w:pPr>
+      <w:r>
+        <w:t>Necessidade</w:t>
+      </w:r>
+    </w:p>
+    <w:p>
+      <w:pPr>
+        <w:pStyle w:val="ListBullet"/>
+      </w:pPr>
+      <w:r>
+        <w:t>Minimização</w:t>
+      </w:r>
+    </w:p>
+    <w:p>
+      <w:pPr>
+        <w:pStyle w:val="ListBullet"/>
+      </w:pPr>
+      <w:r>
+        <w:t>Segurança</w:t>
+      </w:r>
+    </w:p>
+    <w:p>
+      <w:pPr>
+        <w:pStyle w:val="ListBullet"/>
+      </w:pPr>
+      <w:r>
+        <w:t>Prevenção</w:t>
+      </w:r>
+    </w:p>
+    <w:p>
+      <w:r>
+        <w:t>Homologação final compete ao DPO e áreas envolvidas após preenchimento de dados identificação do tratamento, bases legais completas no ROPA e revisões periódicas.</w:t>
+      </w:r>
+    </w:p>
+    <w:p>
+      <w:pPr>
+        <w:pStyle w:val="Heading2"/>
+      </w:pPr>
+      <w:r>
+        <w:t>7. Histórico de revisão</w:t>
+      </w:r>
+    </w:p>
+    <w:p>
+      <w:r>
+        <w:t>O guia das principais atualizações dos formulários e da documentação de privacidade (linguagem orientada ao utilizador, sem detalhes técnicos internos) está disponível para download:</w:t>
+      </w:r>
+    </w:p>
+    <w:p>
+      <w:r>
+        <w:t>Baixar guia de atualizações</w:t>
+      </w:r>
+    </w:p>
+    <w:p>
+      <w:r>
+        <w:t>Revisão: validado periodicamente com Jurídico e Privacidade sempre que há mudança de versão da aplicação ou o fluxo de dados.</w:t>
+      </w:r>
+    </w:p>
+    <w:p>
+      <w:r>
+        <w:t>Última validação em: — (data/hora do último commit/push no repositório Git)</w:t>
+      </w:r>
+    </w:p>
+    <w:p>
+      <w:r>
+        <w:br w:type="page"/>
+      </w:r>
+    </w:p>
+    <w:p>
+      <w:pPr>
+        <w:pStyle w:val="Heading1"/>
+      </w:pPr>
+      <w:r>
+        <w:t>Baseline de segurança</w:t>
+      </w:r>
+    </w:p>
+    <w:p>
+      <w:pPr>
+        <w:pStyle w:val="Heading2"/>
+      </w:pPr>
+      <w:r>
+        <w:t>Arquitetura</w:t>
+      </w:r>
+    </w:p>
+    <w:p>
+      <w:pPr>
+        <w:pStyle w:val="ListBullet"/>
+      </w:pPr>
+      <w:r>
+        <w:t>Aplicação 100% client-side para preenchimento e geração de PDF;</w:t>
+      </w:r>
+    </w:p>
+    <w:p>
+      <w:pPr>
+        <w:pStyle w:val="ListBullet"/>
+      </w:pPr>
+      <w:r>
+        <w:t>Zero persistência centralizada dos dados do formulário em servidores desta solução;</w:t>
+      </w:r>
+    </w:p>
+    <w:p>
+      <w:pPr>
+        <w:pStyle w:val="ListBullet"/>
+      </w:pPr>
+      <w:r>
+        <w:t>Zero transmissão obrigatória dos dados pessoais preenchidos para APIs/backend proprietário desta aplicação para conclusão do PDF.</w:t>
+      </w:r>
+    </w:p>
+    <w:p>
+      <w:r>
+        <w:t>Nota: versões com rascunho local utilizam armazenamento no navegador do usuário; não constitui backend remoto da aplicação. Política de uso desse recurso está em Política de Privacidade e Fluxo de dados.</w:t>
+      </w:r>
+    </w:p>
+    <w:p>
+      <w:pPr>
+        <w:pStyle w:val="Heading2"/>
+      </w:pPr>
+      <w:r>
+        <w:t>Medidas Implementadas</w:t>
+      </w:r>
+    </w:p>
+    <w:p>
+      <w:pPr>
+        <w:pStyle w:val="ListBullet"/>
+      </w:pPr>
+      <w:r>
+        <w:t>HTTPS obrigatório em produção (transporte cifrado);</w:t>
+      </w:r>
+    </w:p>
+    <w:p>
+      <w:pPr>
+        <w:pStyle w:val="ListBullet"/>
+      </w:pPr>
+      <w:r>
+        <w:t>Processamento local dos dados no fluxo de geração do PDF;</w:t>
+      </w:r>
+    </w:p>
+    <w:p>
+      <w:pPr>
+        <w:pStyle w:val="ListBullet"/>
+      </w:pPr>
+      <w:r>
+        <w:t>Descarte de dados da sessão conforme fluxos da aplicação após geração do arquivo;</w:t>
+      </w:r>
+    </w:p>
+    <w:p>
+      <w:pPr>
+        <w:pStyle w:val="ListBullet"/>
+      </w:pPr>
+      <w:r>
+        <w:t>Ausência de envio dos campos do formulário para armazenamento remoto nos termos da arquitetura descrita;</w:t>
+      </w:r>
+    </w:p>
+    <w:p>
+      <w:pPr>
+        <w:pStyle w:val="ListBullet"/>
+      </w:pPr>
+      <w:r>
+        <w:t>Controle de acesso por chave (quando ativo): verificação criptográfica client-side utilizando SHA-256 com salt próprio, sem exposição das chaves reais no código-fonte;</w:t>
+      </w:r>
+    </w:p>
+    <w:p>
+      <w:pPr>
+        <w:pStyle w:val="ListBullet"/>
+      </w:pPr>
+      <w:r>
+        <w:t>Sessão local: token aleatório via crypto.getRandomValues() armazenado em sessionStorage com expiração configurável; limpeza automática ao fechar a aba;</w:t>
+      </w:r>
+    </w:p>
+    <w:p>
+      <w:pPr>
+        <w:pStyle w:val="ListBullet"/>
+      </w:pPr>
+      <w:r>
+        <w:t>Proteção de rotas: páginas formulário protegidas por guard.js que verifica a sessão antes de exibir o conteúdo.</w:t>
+      </w:r>
+    </w:p>
+    <w:p>
+      <w:pPr>
+        <w:pStyle w:val="Heading2"/>
+      </w:pPr>
+      <w:r>
+        <w:t>Restrições Técnicas (desenvolvimento e operação)</w:t>
+      </w:r>
+    </w:p>
+    <w:p>
+      <w:pPr>
+        <w:pStyle w:val="ListBullet"/>
+      </w:pPr>
+      <w:r>
+        <w:t>Não utilizar localStorage / sessionStorage para fins não documentados ou além do escopo de rascunho aprovado;</w:t>
+      </w:r>
+    </w:p>
+    <w:p>
+      <w:pPr>
+        <w:pStyle w:val="ListBullet"/>
+      </w:pPr>
+      <w:r>
+        <w:t>Proibido registrar em logs de aplicação conteúdo de formulários com dados pessoais ou dados sensíveis;</w:t>
+      </w:r>
+    </w:p>
+    <w:p>
+      <w:pPr>
+        <w:pStyle w:val="ListBullet"/>
+      </w:pPr>
+      <w:r>
+        <w:t>Proibido integrar esta camada com APIs externas para envio dos dados preenchidos sem avaliação de impacto, contrato e base legal;</w:t>
+      </w:r>
+    </w:p>
+    <w:p>
+      <w:pPr>
+        <w:pStyle w:val="ListBullet"/>
+      </w:pPr>
+      <w:r>
+        <w:t>Controle de alterações no repositório (pull requests revisados, permissões mínimas nos ambientes de CI/CD);</w:t>
+      </w:r>
+    </w:p>
+    <w:p>
+      <w:pPr>
+        <w:pStyle w:val="ListBullet"/>
+      </w:pPr>
+      <w:r>
+        <w:t>Chaves de acesso tratadas como segredos de configuração; verificadores derivados (SHA-256 + salt) são os únicos elementos presentes no código-fonte;</w:t>
+      </w:r>
+    </w:p>
+    <w:p>
+      <w:pPr>
+        <w:pStyle w:val="ListBullet"/>
+      </w:pPr>
+      <w:r>
+        <w:t>Scripts de geração de verificadores e verificação de vazamento são mantidos fora do repositório (gitignored).</w:t>
+      </w:r>
+    </w:p>
+    <w:p>
+      <w:pPr>
+        <w:pStyle w:val="Heading2"/>
+      </w:pPr>
+      <w:r>
+        <w:t>Proteção de Acesso (Client-Side)</w:t>
+      </w:r>
+    </w:p>
+    <w:p>
+      <w:r>
+        <w:t>Quando ativo, o sistema de proteção funciona exclusivamente no navegador:</w:t>
+      </w:r>
+    </w:p>
+    <w:p>
+      <w:pPr>
+        <w:pStyle w:val="ListBullet"/>
+      </w:pPr>
+      <w:r>
+        <w:t>Algoritmo: normalização da entrada → concatenação com salt → SHA-256 → transformação determinística (bit reversal, XOR, swap) → comparação com verificador armazenado;</w:t>
+      </w:r>
+    </w:p>
+    <w:p>
+      <w:pPr>
+        <w:pStyle w:val="ListBullet"/>
+      </w:pPr>
+      <w:r>
+        <w:t>Sessão: token aleatório gerado via Web Crypto API, expiração configurável (padrão: 60 min), refresh automático em cada navegação/interação;</w:t>
+      </w:r>
+    </w:p>
+    <w:p>
+      <w:pPr>
+        <w:pStyle w:val="ListBullet"/>
+      </w:pPr>
+      <w:r>
+        <w:t>Armazenamento: apenas sessionStorage (token + timestamp + path); a chave original nunca é armazenada;</w:t>
+      </w:r>
+    </w:p>
+    <w:p>
+      <w:pPr>
+        <w:pStyle w:val="ListBullet"/>
+      </w:pPr>
+      <w:r>
+        <w:t>Limitação: proteção client-side contra acesso casual; não substitui autenticação server-side.</w:t>
+      </w:r>
+    </w:p>
+    <w:p>
+      <w:pPr>
+        <w:pStyle w:val="Heading2"/>
+      </w:pPr>
+      <w:r>
+        <w:t>Camada de Entrega</w:t>
+      </w:r>
+    </w:p>
+    <w:p>
+      <w:r>
+        <w:t>Área  ·  Expectativa</w:t>
+      </w:r>
+    </w:p>
+    <w:p>
+      <w:r>
+        <w:t>Repositório  ·  Apenas pessoas autorizadas; branch protection quando aplicável</w:t>
+      </w:r>
+    </w:p>
+    <w:p>
+      <w:r>
+        <w:t>Build/deploy  ·  Pipeline auditável; artefatos verificáveis</w:t>
+      </w:r>
+    </w:p>
+    <w:p>
+      <w:r>
+        <w:t>Dependências  ·  Inventário das bibliotecas JS (PDF, etc.); plano de atualização por CVE</w:t>
+      </w:r>
+    </w:p>
+    <w:p>
+      <w:r>
+        <w:t>Hospedagem  ·  HTTPS; eventual CDN/WAF conforme política corporativa</w:t>
+      </w:r>
+    </w:p>
+    <w:p>
+      <w:pPr>
+        <w:pStyle w:val="Heading2"/>
+      </w:pPr>
+      <w:r>
+        <w:t>Risco Residual</w:t>
+      </w:r>
+    </w:p>
+    <w:p>
+      <w:r>
+        <w:t>Baixo no que respeita a exposição por armazenamento central nesta aplicação ou por transmissão obrigatória dos formulários para servidores da ferramenta — dados sob responsabilidade direta do usuário após download do PDF e, quando ativo, rascunho apenas local.</w:t>
+      </w:r>
+    </w:p>
+    <w:p>
+      <w:r>
+        <w:t>Riscos remanescentes incluem: uso de equipamento comprometido, partilha de sessão em terminal público, ou alteração maliciosa dos ficheiros estáticos servidos — mitigados por controles de CI/CD, HTTPS e resposta a incidentes (Plano de resposta a incidentes).</w:t>
+      </w:r>
+    </w:p>
+    <w:p>
+      <w:pPr>
+        <w:pStyle w:val="Heading2"/>
+      </w:pPr>
+      <w:r>
+        <w:t>Revisão</w:t>
+      </w:r>
+    </w:p>
+    <w:p>
+      <w:r>
+        <w:t>Revisar esta baseline quando houver mudança de hospedagem, dependências críticas ou novos fluxos de dados.</w:t>
+      </w:r>
+    </w:p>
+    <w:p>
+      <w:r>
+        <w:t>Revisão: validado periodicamente com Jurídico e Privacidade sempre que há mudança de versão da aplicação ou o fluxo de dados.</w:t>
+      </w:r>
+    </w:p>
+    <w:p>
+      <w:r>
+        <w:t>Última validação em: — (data/hora do último commit/push no repositório Git)</w:t>
+      </w:r>
+    </w:p>
+    <w:p>
+      <w:r>
+        <w:br w:type="page"/>
+      </w:r>
+    </w:p>
+    <w:p>
+      <w:pPr>
+        <w:pStyle w:val="Heading1"/>
+      </w:pPr>
+      <w:r>
+        <w:t>Resposta a incidentes</w:t>
+      </w:r>
+    </w:p>
+    <w:p>
+      <w:r>
+        <w:t>Documento alinhado ao modelo corporativo de referência, estruturado para integração com Segurança da Informação e Privacidade (LGPD).</w:t>
+      </w:r>
+    </w:p>
+    <w:p>
+      <w:pPr>
+        <w:pStyle w:val="Heading2"/>
+      </w:pPr>
+      <w:r>
+        <w:t>1. Possíveis incidentes (exemplos)</w:t>
+      </w:r>
+    </w:p>
+    <w:p>
+      <w:pPr>
+        <w:pStyle w:val="ListBullet"/>
+      </w:pPr>
+      <w:r>
+        <w:t>Integridade da aplicação: alteração não autorizada dos ficheiros estáticos ou do repositório (supply chain / deploy);</w:t>
+      </w:r>
+    </w:p>
+    <w:p>
+      <w:pPr>
+        <w:pStyle w:val="ListBullet"/>
+      </w:pPr>
+      <w:r>
+        <w:t>Disponibilidade: indisponibilidade prolongada da hospedagem ou CDN;</w:t>
+      </w:r>
+    </w:p>
+    <w:p>
+      <w:pPr>
+        <w:pStyle w:val="ListBullet"/>
+      </w:pPr>
+      <w:r>
+        <w:t>Confidencialidade local: vazamento ou exposição indevida relacionada ao uso do browser ou do dispositivo (PDF descarregado, equipamento partilhado, malware local);</w:t>
+      </w:r>
+    </w:p>
+    <w:p>
+      <w:pPr>
+        <w:pStyle w:val="ListBullet"/>
+      </w:pPr>
+      <w:r>
+        <w:t>Uso indevido: utilização da plataforma contra políticas internas ou tentativa de abuso técnico.</w:t>
+      </w:r>
+    </w:p>
+    <w:p>
+      <w:pPr>
+        <w:pStyle w:val="Heading2"/>
+      </w:pPr>
+      <w:r>
+        <w:t>2. Classificação inicial</w:t>
+      </w:r>
+    </w:p>
+    <w:p>
+      <w:r>
+        <w:t>Nível  ·  Descrição sumária</w:t>
+      </w:r>
+    </w:p>
+    <w:p>
+      <w:r>
+        <w:t>Alto  ·  Comprometimento confirmado do que é servido aos utilizadores ou da cadeia de build</w:t>
+      </w:r>
+    </w:p>
+    <w:p>
+      <w:r>
+        <w:t>Médio  ·  Indisponibilidade relevante ou suspeita de alteração ainda não confirmada</w:t>
+      </w:r>
+    </w:p>
+    <w:p>
+      <w:r>
+        <w:t>Baixo  ·  Eventos limitados sem impacto direto em dados ou sem alteração de conteúdo</w:t>
+      </w:r>
+    </w:p>
+    <w:p>
+      <w:pPr>
+        <w:pStyle w:val="Heading2"/>
+      </w:pPr>
+      <w:r>
+        <w:t>3. Ações (fluxo)</w:t>
+      </w:r>
+    </w:p>
+    <w:p>
+      <w:r>
+        <w:t>1. Identificação e registo — abrir registo de incidente; preservar evidências (hashes, commits, logs de infraestrutura permitidos).</w:t>
+      </w:r>
+    </w:p>
+    <w:p>
+      <w:r>
+        <w:t>2. Contenção imediata — revert deploy, desativar versão comprometida, invalidar cache se aplicável.</w:t>
+      </w:r>
+    </w:p>
+    <w:p>
+      <w:r>
+        <w:t>3. Investigação — causa raiz, alcance temporal, dados afetados (se aplicável ao âmbito LGPD).</w:t>
+      </w:r>
+    </w:p>
+    <w:p>
+      <w:r>
+        <w:t>4. Correção e recuperação — patch, novo deploy verificado, testes.</w:t>
+      </w:r>
+    </w:p>
+    <w:p>
+      <w:r>
+        <w:t>5. Comunicação — stakeholders internos; avaliar comunicação a titulares e à ANPD com Jurídico e DPO quando houver dados pessoais afetados (LGPD).</w:t>
+      </w:r>
+    </w:p>
+    <w:p>
+      <w:r>
+        <w:t>6. Encerramento e melhoria — atualizar Baseline de segurança, checklist de deploy ou controles preventivos.</w:t>
+      </w:r>
+    </w:p>
+    <w:p>
+      <w:pPr>
+        <w:pStyle w:val="Heading2"/>
+      </w:pPr>
+      <w:r>
+        <w:t>4. Observação sobre impacto</w:t>
+      </w:r>
+    </w:p>
+    <w:p>
+      <w:r>
+        <w:t>Na ausência de base de dados centralizada nesta aplicação para os formulários, muitos cenários concentram risco no dispositivo do usuário ou na integridade do site estático. Mesmo assim, incidentes que envolvam dados pessoais (por exemplo divulgação indevisa por erro processual) devem seguir o programa de gestão de incidentes da organização.</w:t>
+      </w:r>
+    </w:p>
+    <w:p>
+      <w:pPr>
+        <w:pStyle w:val="Heading2"/>
+      </w:pPr>
+      <w:r>
+        <w:t>5. Responsabilidades</w:t>
+      </w:r>
+    </w:p>
+    <w:p>
+      <w:r>
+        <w:t>Papel  ·  Atuação típica</w:t>
+      </w:r>
+    </w:p>
+    <w:p>
+      <w:r>
+        <w:t>Segurança da Informação  ·  Coordenação técnica e classificação</w:t>
+      </w:r>
+    </w:p>
+    <w:p>
+      <w:r>
+        <w:t>DPO / Privacidade  ·  Avaliação LGPD e comunicações obrigatórias</w:t>
+      </w:r>
+    </w:p>
+    <w:p>
+      <w:r>
+        <w:t>TI  ·  Infraestrutura, reversão de deploy, logs</w:t>
+      </w:r>
+    </w:p>
+    <w:p>
+      <w:pPr>
+        <w:pStyle w:val="Heading2"/>
+      </w:pPr>
+      <w:r>
+        <w:t>6. Testes</w:t>
+      </w:r>
+    </w:p>
+    <w:p>
+      <w:r>
+        <w:t>Realizar simulacros ou tabletop exercises periodicamente (definir cadência interna).</w:t>
+      </w:r>
+    </w:p>
+    <w:p>
+      <w:r>
+        <w:t>Revisão: validado periodicamente com Jurídico e Privacidade sempre que há mudança de versão da aplicação ou o fluxo de dados.</w:t>
+      </w:r>
+    </w:p>
+    <w:p>
+      <w:r>
+        <w:t>Última validação em: — (data/hora do último commit/push no repositório Git)</w:t>
+      </w:r>
+    </w:p>
+    <w:p>
+      <w:r>
+        <w:br w:type="page"/>
+      </w:r>
+    </w:p>
+    <w:p>
+      <w:pPr>
+        <w:pStyle w:val="Heading1"/>
+      </w:pPr>
+      <w:r>
+        <w:t>Base legal (LGPD)</w:t>
+      </w:r>
+    </w:p>
+    <w:p>
+      <w:pPr>
+        <w:pStyle w:val="Heading2"/>
+      </w:pPr>
+      <w:r>
+        <w:t>Fundamentação</w:t>
+      </w:r>
+    </w:p>
+    <w:p>
+      <w:r>
+        <w:t>O tratamento ocorre com base em:</w:t>
+      </w:r>
+    </w:p>
+    <w:p>
+      <w:pPr>
+        <w:pStyle w:val="ListBullet"/>
+      </w:pPr>
+      <w:r>
+        <w:t>Execução de procedimento solicitado pelo titular — o próprio usuário inicia o preenchimento e solicita, pela utilização da ferramenta, a geração do documento PDF com os dados por si indicados.</w:t>
+      </w:r>
+    </w:p>
+    <w:p>
+      <w:r>
+        <w:t>Tratamentos adicionais no âmbito organizacional (ex.: arquivo de admissão em sistemas corporativos fora desta aplicação client-side) devem constar do inventário de tratamentos (ROPA) com bases próprias.</w:t>
+      </w:r>
+    </w:p>
+    <w:p>
+      <w:pPr>
+        <w:pStyle w:val="Heading2"/>
+      </w:pPr>
+      <w:r>
+        <w:t>Justificativa</w:t>
+      </w:r>
+    </w:p>
+    <w:p>
+      <w:pPr>
+        <w:pStyle w:val="ListBullet"/>
+      </w:pPr>
+      <w:r>
+        <w:t>Usuário insere dados voluntariamente;</w:t>
+      </w:r>
+    </w:p>
+    <w:p>
+      <w:pPr>
+        <w:pStyle w:val="ListBullet"/>
+      </w:pPr>
+      <w:r>
+        <w:t>Dados usados para composição local do PDF e, quando existir, apenas para manter rascunho opcional no próprio navegador até decisão do usuário ou conclusão do fluxo;</w:t>
+      </w:r>
+    </w:p>
+    <w:p>
+      <w:pPr>
+        <w:pStyle w:val="ListBullet"/>
+      </w:pPr>
+      <w:r>
+        <w:t>Não há armazenamento centralizado dos dados do formulário nos servidores desta aplicação para fins descritos na Política de Privacidade aplicável à ferramenta web estática.</w:t>
+      </w:r>
+    </w:p>
+    <w:p>
+      <w:pPr>
+        <w:pStyle w:val="Heading2"/>
+      </w:pPr>
+      <w:r>
+        <w:t>Hipóteses adicionais (referência normativa)</w:t>
+      </w:r>
+    </w:p>
+    <w:p>
+      <w:r>
+        <w:t>Conforme análise jurídica caso a caso, podem aplicar-se outras hipóteses do art. 7º ou, para dados sensíveis, art. 11º da Lei nº 13.709/2018 — vide inventário corporativo e parecer jurídico. O documento Política de Privacidade e os fluxos de assistência médica podem envolver dados cuja base legal exige avaliação específica.</w:t>
+      </w:r>
+    </w:p>
+    <w:p>
+      <w:pPr>
+        <w:pStyle w:val="Heading2"/>
+      </w:pPr>
+      <w:r>
+        <w:t>Conclusão</w:t>
+      </w:r>
+    </w:p>
+    <w:p>
+      <w:r>
+        <w:t>Tratamento compatível com LGPD quando observadas minimização, transparência (incluindo comunicações na própria aplicação), segurança conforme Baseline de segurança e governança em Governança.</w:t>
+      </w:r>
+    </w:p>
+    <w:p>
+      <w:r>
+        <w:t>Revisão: validado periodicamente com Jurídico e Privacidade sempre que há mudança de versão da aplicação ou o fluxo de dados.</w:t>
+      </w:r>
+    </w:p>
+    <w:p>
+      <w:r>
+        <w:t>Última validação em: — (data/hora do último commit/push no repositório Git)</w:t>
+      </w:r>
+    </w:p>
+    <w:p>
+      <w:r>
+        <w:br w:type="page"/>
+      </w:r>
+    </w:p>
+    <w:p>
+      <w:pPr>
+        <w:pStyle w:val="Heading1"/>
+      </w:pPr>
+      <w:r>
+        <w:t>Governança</w:t>
+      </w:r>
+    </w:p>
+    <w:p>
+      <w:pPr>
+        <w:pStyle w:val="Heading2"/>
+      </w:pPr>
+      <w:r>
+        <w:t>Princípios</w:t>
+      </w:r>
+    </w:p>
+    <w:p>
+      <w:pPr>
+        <w:pStyle w:val="ListBullet"/>
+      </w:pPr>
+      <w:r>
+        <w:t>Privacy by Design — privacidade considerada desde o desenho da solução e dos processos;</w:t>
+      </w:r>
+    </w:p>
+    <w:p>
+      <w:pPr>
+        <w:pStyle w:val="ListBullet"/>
+      </w:pPr>
+      <w:r>
+        <w:t>Minimização de dados — apenas o necessário ao preenchimento e à geração do PDF (e rascunho local, quando existir, estritamente para esse fim);</w:t>
+      </w:r>
+    </w:p>
+    <w:p>
+      <w:pPr>
+        <w:pStyle w:val="ListBullet"/>
+      </w:pPr>
+      <w:r>
+        <w:t>Transparência — políticas e comunicações na aplicação (Política de Privacidade, modais, termos).</w:t>
+      </w:r>
+    </w:p>
+    <w:p>
+      <w:pPr>
+        <w:pStyle w:val="Heading2"/>
+      </w:pPr>
+      <w:r>
+        <w:t>Diretrizes</w:t>
+      </w:r>
+    </w:p>
+    <w:p>
+      <w:pPr>
+        <w:pStyle w:val="ListBullet"/>
+      </w:pPr>
+      <w:r>
+        <w:t>Não coletar dados desnecessários para além dos campos dos formulários institucionais;</w:t>
+      </w:r>
+    </w:p>
+    <w:p>
+      <w:pPr>
+        <w:pStyle w:val="ListBullet"/>
+      </w:pPr>
+      <w:r>
+        <w:t>Não armazenar dados em servidor desta aplicação para fins de cadastro web centralizado dos formulários;</w:t>
+      </w:r>
+    </w:p>
+    <w:p>
+      <w:pPr>
+        <w:pStyle w:val="ListBullet"/>
+      </w:pPr>
+      <w:r>
+        <w:t>Garantir segurança no processamento conforme Baseline de segurança;</w:t>
+      </w:r>
+    </w:p>
+    <w:p>
+      <w:pPr>
+        <w:pStyle w:val="ListBullet"/>
+      </w:pPr>
+      <w:r>
+        <w:t>Manter documentação em /Docs alinhada à versão implantada da aplicação;</w:t>
+      </w:r>
+    </w:p>
+    <w:p>
+      <w:pPr>
+        <w:pStyle w:val="ListBullet"/>
+      </w:pPr>
+      <w:r>
+        <w:t>Coordenação entre Privacidade (DPO), Jurídico, Segurança da Informação e TI para alterações que afetem dados pessoais ou risco.</w:t>
+      </w:r>
+    </w:p>
+    <w:p>
+      <w:pPr>
+        <w:pStyle w:val="Heading2"/>
+      </w:pPr>
+      <w:r>
+        <w:t>Papéis (resumo)</w:t>
+      </w:r>
+    </w:p>
+    <w:p>
+      <w:r>
+        <w:t>Papel  ·  Função</w:t>
+      </w:r>
+    </w:p>
+    <w:p>
+      <w:r>
+        <w:t>Responsável pelo tratamento  ·  Definição das finalidades institucionais (corporativo)</w:t>
+      </w:r>
+    </w:p>
+    <w:p>
+      <w:r>
+        <w:t>DPO / Privacidade  ·  Supervisão LGPD, interfaces com titulares e órgão fiscalizador</w:t>
+      </w:r>
+    </w:p>
+    <w:p>
+      <w:r>
+        <w:t>Jurídico  ·  Validade de termos, bases legais e contratos</w:t>
+      </w:r>
+    </w:p>
+    <w:p>
+      <w:r>
+        <w:t>Segurança da Informação  ·  Baseline, incidentes, exceções</w:t>
+      </w:r>
+    </w:p>
+    <w:p>
+      <w:r>
+        <w:t>TI / DevOps  ·  Pipeline, hospedagem, permissões de repositório</w:t>
+      </w:r>
+    </w:p>
+    <w:p>
+      <w:pPr>
+        <w:pStyle w:val="Heading2"/>
+      </w:pPr>
+      <w:r>
+        <w:t>Revisões</w:t>
+      </w:r>
+    </w:p>
+    <w:p>
+      <w:pPr>
+        <w:pStyle w:val="ListBullet"/>
+      </w:pPr>
+      <w:r>
+        <w:t>nova versão da aplicação com mudança de fluxo de dados;</w:t>
+      </w:r>
+    </w:p>
+    <w:p>
+      <w:pPr>
+        <w:pStyle w:val="ListBullet"/>
+      </w:pPr>
+      <w:r>
+        <w:t>alteração legal ou orientação da ANPD;</w:t>
+      </w:r>
+    </w:p>
+    <w:p>
+      <w:pPr>
+        <w:pStyle w:val="ListBullet"/>
+      </w:pPr>
+      <w:r>
+        <w:t>incidente com lições aprendidas relevantes.</w:t>
+      </w:r>
+    </w:p>
+    <w:p>
+      <w:pPr>
+        <w:pStyle w:val="ListBullet"/>
+      </w:pPr>
+      <w:r>
+        <w:t>Documentação revisada periodicamente e ad hoc quando houver:</w:t>
+      </w:r>
+    </w:p>
+    <w:p>
+      <w:r>
+        <w:t>Registar datas de aprovação nas versões dos documentos ou em registo interno de governança.</w:t>
+      </w:r>
+    </w:p>
+    <w:p>
+      <w:pPr>
+        <w:pStyle w:val="Heading2"/>
+      </w:pPr>
+      <w:r>
+        <w:t>Documentação de referência</w:t>
+      </w:r>
+    </w:p>
+    <w:p>
+      <w:r>
+        <w:t>Documento  ·  Uso</w:t>
+      </w:r>
+    </w:p>
+    <w:p>
+      <w:r>
+        <w:t>Política de Privacidade  ·  Transparência ao usuário/titular</w:t>
+      </w:r>
+    </w:p>
+    <w:p>
+      <w:r>
+        <w:t>Termos de Uso  ·  Regras de uso da ferramenta</w:t>
+      </w:r>
+    </w:p>
+    <w:p>
+      <w:r>
+        <w:t>Fluxo de dados  ·  Base técnica e RIPD</w:t>
+      </w:r>
+    </w:p>
+    <w:p>
+      <w:r>
+        <w:t>Base legal (LGPD)  ·  Fundamentos normativos</w:t>
+      </w:r>
+    </w:p>
+    <w:p>
+      <w:r>
+        <w:t>Baseline de segurança  ·  Controles mínimos</w:t>
+      </w:r>
+    </w:p>
+    <w:p>
+      <w:r>
+        <w:t>Resposta a incidentes  ·  Resposta a incidentes</w:t>
+      </w:r>
+    </w:p>
+    <w:p>
+      <w:r>
+        <w:t>RIPD  ·  Avaliação de impacto</w:t>
       </w:r>
     </w:p>
     <w:p>

</xml_diff>